<commit_message>
Indicators v28 / UK v33: MCCIP indicator block (IFW-12, IND-M-001–016)
- New 'MCCIP Indicators' sheet and register row IFW-12: the 16 physical-environment and
  ecosystem-change topics of the MCCIP Impacts Hub, read at source 6 Oct 2026.
- Climate scores checked against outputs_other/CLIMATE_SCORE_METHOD.md (1/2/3 = 3/3/10),
  with rule G siblings cited in each rationale.
- POL-049 links to IFW-12; finder gains the MCCIP framework and filter.
- Counts updated to 1,001 records across docs; queue and Open work resolved.

Co-Authored-By: Claude Opus 5.5 <noreply@anthropic.com>
Claude-Session: https://claude.ai/code/session_01AXpUr5Jv7F4hv6YdhfHEwx
</commit_message>
<xml_diff>
--- a/Exports/docx/CLIMATE_SCORE_METHOD.docx
+++ b/Exports/docx/CLIMATE_SCORE_METHOD.docx
@@ -1974,6 +1974,18 @@
     <w:p/>
     <w:p>
       <w:r>
+        <w:rPr>
+          <w:b/>
+        </w:rPr>
+        <w:t>Added after harmonisation:</w:t>
+      </w:r>
+      <w:r>
+        <w:rPr/>
+        <w:t xml:space="preserve"> the MCCIP sheet (indicators v28, 6 October 2026), 16 records scored under these rules — 0 / 1 / 2 / 3 = 0 / 3 / 3 / 10. The ten 3s are the nine physical climate-system variables (rule E ii) and seabirds and waterbirds, where the wintering-waterbird component governs (rule F, aligned with [IND-J-013]).</w:t>
+      </w:r>
+    </w:p>
+    <w:p>
+      <w:r>
         <w:rPr/>
         <w:t>The shape is what each framework should look like. The CCC sheet has the most 3s — adaptation targets defined in climatic terms, hydrological measures and weather-corrected emissions — and also many 0s, because mitigation deployment measures (installations, capacity, sales) take no climate data. The SDG and GBF sheets are dominated by social, financial and governance measures, so mostly 0. EEA carries a block of explicit climate indicators (temperature, sea level, ocean heat, drought, wildfire).</w:t>
       </w:r>

</xml_diff>